<commit_message>
Embed six figures into the detailed review (block 32)
EI-by-gender, founder x industry, low-EI congruence, robustness
coefficients, success mechanism, and pitch-order interaction.

https://claude.ai/code/session_01L68e4qRUQ3XwBSVpuorTML
</commit_message>
<xml_diff>
--- a/analysis/32_detailed_review.docx
+++ b/analysis/32_detailed_review.docx
@@ -112,6 +112,83 @@
       </w:pPr>
       <w:r>
         <w:t>Because EI is the central individual-difference variable, gender differences in the WLEIS were examined before the substantive hypotheses. Female participants reported significantly higher total emotional intelligence (M = 5.32, SD = 0.77) than male participants (M = 4.97, SD = 0.71), Welch t(182) = 3.19, p = .002, d = 0.47. This difference was concentrated in the two appraisal dimensions: self-emotion appraisal (M = 5.46 vs 4.83, p &lt; .001, d = 0.59) and others' emotion appraisal (M = 5.74 vs 5.05, p &lt; .001, d = 0.66). The use-of-emotion and regulation-of-emotion dimensions showed no significant gender difference, with regulation being numerically, though not significantly, higher among men. The gender effect on total EI, SEA, and OEA remained essentially unchanged after controlling for age and for STEM versus non-STEM field of study, and the two gender groups were well matched on these covariates. This pattern is consistent with the wider EI literature, in which women score higher on perceiving and appraising emotions while regulation and instrumental use show small or null differences. It also carries a methodological implication: because EI is correlated with participant gender, any test of whether EI's moderating role differs between male and female participants necessarily operates on a restricted EI range within each gender and is correspondingly less sensitive.</w:t>
+      </w:r>
+    </w:p>
+    <w:p>
+      <w:pPr>
+        <w:spacing w:before="160"/>
+      </w:pPr>
+      <w:r>
+        <w:rPr>
+          <w:b/>
+        </w:rPr>
+        <w:t>Figure 1</w:t>
+      </w:r>
+      <w:r>
+        <w:t xml:space="preserve">  </w:t>
+      </w:r>
+      <w:r>
+        <w:rPr>
+          <w:i/>
+        </w:rPr>
+        <w:t>Emotional Intelligence by Participant Gender</w:t>
+      </w:r>
+    </w:p>
+    <w:p>
+      <w:pPr>
+        <w:jc w:val="center"/>
+      </w:pPr>
+      <w:r>
+        <w:drawing>
+          <wp:inline xmlns:a="http://schemas.openxmlformats.org/drawingml/2006/main" xmlns:pic="http://schemas.openxmlformats.org/drawingml/2006/picture">
+            <wp:extent cx="5303520" cy="3354982"/>
+            <wp:docPr id="1" name="Picture 1"/>
+            <wp:cNvGraphicFramePr>
+              <a:graphicFrameLocks noChangeAspect="1"/>
+            </wp:cNvGraphicFramePr>
+            <a:graphic>
+              <a:graphicData uri="http://schemas.openxmlformats.org/drawingml/2006/picture">
+                <pic:pic>
+                  <pic:nvPicPr>
+                    <pic:cNvPr id="0" name="fig22_ei_by_gender.png"/>
+                    <pic:cNvPicPr/>
+                  </pic:nvPicPr>
+                  <pic:blipFill>
+                    <a:blip r:embed="rId9"/>
+                    <a:stretch>
+                      <a:fillRect/>
+                    </a:stretch>
+                  </pic:blipFill>
+                  <pic:spPr>
+                    <a:xfrm>
+                      <a:off x="0" y="0"/>
+                      <a:ext cx="5303520" cy="3354982"/>
+                    </a:xfrm>
+                    <a:prstGeom prst="rect"/>
+                  </pic:spPr>
+                </pic:pic>
+              </a:graphicData>
+            </a:graphic>
+          </wp:inline>
+        </w:drawing>
+      </w:r>
+    </w:p>
+    <w:p>
+      <w:pPr>
+        <w:spacing w:after="200"/>
+      </w:pPr>
+      <w:r>
+        <w:rPr>
+          <w:i/>
+          <w:sz w:val="20"/>
+        </w:rPr>
+        <w:t xml:space="preserve">Note. </w:t>
+      </w:r>
+      <w:r>
+        <w:rPr>
+          <w:sz w:val="20"/>
+        </w:rPr>
+        <w:t>WLEIS means (±1 SE) for male and female participants. * p &lt; .05, ** p &lt; .01, *** p &lt; .001; ns = not significant.</w:t>
       </w:r>
     </w:p>
     <w:p>
@@ -292,6 +369,83 @@
     </w:p>
     <w:p>
       <w:pPr>
+        <w:spacing w:before="160"/>
+      </w:pPr>
+      <w:r>
+        <w:rPr>
+          <w:b/>
+        </w:rPr>
+        <w:t>Figure 2</w:t>
+      </w:r>
+      <w:r>
+        <w:t xml:space="preserve">  </w:t>
+      </w:r>
+      <w:r>
+        <w:rPr>
+          <w:i/>
+        </w:rPr>
+        <w:t>Investment by Founder Gender and Industry Typing</w:t>
+      </w:r>
+    </w:p>
+    <w:p>
+      <w:pPr>
+        <w:jc w:val="center"/>
+      </w:pPr>
+      <w:r>
+        <w:drawing>
+          <wp:inline xmlns:a="http://schemas.openxmlformats.org/drawingml/2006/main" xmlns:pic="http://schemas.openxmlformats.org/drawingml/2006/picture">
+            <wp:extent cx="5303520" cy="3692780"/>
+            <wp:docPr id="2" name="Picture 2"/>
+            <wp:cNvGraphicFramePr>
+              <a:graphicFrameLocks noChangeAspect="1"/>
+            </wp:cNvGraphicFramePr>
+            <a:graphic>
+              <a:graphicData uri="http://schemas.openxmlformats.org/drawingml/2006/picture">
+                <pic:pic>
+                  <pic:nvPicPr>
+                    <pic:cNvPr id="0" name="fig16_incongruent_penalty.png"/>
+                    <pic:cNvPicPr/>
+                  </pic:nvPicPr>
+                  <pic:blipFill>
+                    <a:blip r:embed="rId10"/>
+                    <a:stretch>
+                      <a:fillRect/>
+                    </a:stretch>
+                  </pic:blipFill>
+                  <pic:spPr>
+                    <a:xfrm>
+                      <a:off x="0" y="0"/>
+                      <a:ext cx="5303520" cy="3692780"/>
+                    </a:xfrm>
+                    <a:prstGeom prst="rect"/>
+                  </pic:spPr>
+                </pic:pic>
+              </a:graphicData>
+            </a:graphic>
+          </wp:inline>
+        </w:drawing>
+      </w:r>
+    </w:p>
+    <w:p>
+      <w:pPr>
+        <w:spacing w:after="200"/>
+      </w:pPr>
+      <w:r>
+        <w:rPr>
+          <w:i/>
+          <w:sz w:val="20"/>
+        </w:rPr>
+        <w:t xml:space="preserve">Note. </w:t>
+      </w:r>
+      <w:r>
+        <w:rPr>
+          <w:sz w:val="20"/>
+        </w:rPr>
+        <w:t>Mean amount invested (±1 SE). Cell A = female founders in the male-typed industry (SiteVision); Cell B = male founders in the female-typed industry (BalanceUp).</w:t>
+      </w:r>
+    </w:p>
+    <w:p>
+      <w:pPr>
         <w:pStyle w:val="Heading2"/>
       </w:pPr>
       <w:r>
@@ -304,6 +458,83 @@
       </w:pPr>
       <w:r>
         <w:t>The third result is the EI-relevant one. Among participants below the median on total WLEIS, investment in the masculine-congruent startup (a male founder in the male-typed SiteVision) exceeded investment in the feminine-congruent startup (a female founder in the female-typed BalanceUp): M = 2.22 versus 1.76, one-tailed Welch p = .032, Mann–Whitney p = .021, d = 0.50. The same low-EI participants rated the masculine-congruent venture as both more likely to succeed (p = .008) and somewhat riskier (p = .045), a profile consistent with stereotype-consistent, heuristic processing that is not corrected by emotional self-regulation. This result is the empirical anchor for the thesis's claim that EI conditions the expression of gender-congruity bias, although, as set out below, it is statistically the most fragile of the three.</w:t>
+      </w:r>
+    </w:p>
+    <w:p>
+      <w:pPr>
+        <w:spacing w:before="160"/>
+      </w:pPr>
+      <w:r>
+        <w:rPr>
+          <w:b/>
+        </w:rPr>
+        <w:t>Figure 3</w:t>
+      </w:r>
+      <w:r>
+        <w:t xml:space="preserve">  </w:t>
+      </w:r>
+      <w:r>
+        <w:rPr>
+          <w:i/>
+        </w:rPr>
+        <w:t>Low-EI Participants: Masculine- versus Feminine-Congruent Investment</w:t>
+      </w:r>
+    </w:p>
+    <w:p>
+      <w:pPr>
+        <w:jc w:val="center"/>
+      </w:pPr>
+      <w:r>
+        <w:drawing>
+          <wp:inline xmlns:a="http://schemas.openxmlformats.org/drawingml/2006/main" xmlns:pic="http://schemas.openxmlformats.org/drawingml/2006/picture">
+            <wp:extent cx="4389120" cy="3731999"/>
+            <wp:docPr id="3" name="Picture 3"/>
+            <wp:cNvGraphicFramePr>
+              <a:graphicFrameLocks noChangeAspect="1"/>
+            </wp:cNvGraphicFramePr>
+            <a:graphic>
+              <a:graphicData uri="http://schemas.openxmlformats.org/drawingml/2006/picture">
+                <pic:pic>
+                  <pic:nvPicPr>
+                    <pic:cNvPr id="0" name="fig14_lowEI_congruence.png"/>
+                    <pic:cNvPicPr/>
+                  </pic:nvPicPr>
+                  <pic:blipFill>
+                    <a:blip r:embed="rId11"/>
+                    <a:stretch>
+                      <a:fillRect/>
+                    </a:stretch>
+                  </pic:blipFill>
+                  <pic:spPr>
+                    <a:xfrm>
+                      <a:off x="0" y="0"/>
+                      <a:ext cx="4389120" cy="3731999"/>
+                    </a:xfrm>
+                    <a:prstGeom prst="rect"/>
+                  </pic:spPr>
+                </pic:pic>
+              </a:graphicData>
+            </a:graphic>
+          </wp:inline>
+        </w:drawing>
+      </w:r>
+    </w:p>
+    <w:p>
+      <w:pPr>
+        <w:spacing w:after="200"/>
+      </w:pPr>
+      <w:r>
+        <w:rPr>
+          <w:i/>
+          <w:sz w:val="20"/>
+        </w:rPr>
+        <w:t xml:space="preserve">Note. </w:t>
+      </w:r>
+      <w:r>
+        <w:rPr>
+          <w:sz w:val="20"/>
+        </w:rPr>
+        <w:t>Mean amount invested (±1 SE) among participants below the median on total WLEIS. The bracket reports the one-tailed test.</w:t>
       </w:r>
     </w:p>
     <w:p>
@@ -1183,6 +1414,160 @@
     </w:p>
     <w:p>
       <w:pPr>
+        <w:spacing w:before="160"/>
+      </w:pPr>
+      <w:r>
+        <w:rPr>
+          <w:b/>
+        </w:rPr>
+        <w:t>Figure 4</w:t>
+      </w:r>
+      <w:r>
+        <w:t xml:space="preserve">  </w:t>
+      </w:r>
+      <w:r>
+        <w:rPr>
+          <w:i/>
+        </w:rPr>
+        <w:t>Adjusted Effect Coefficients Across Robustness Specifications</w:t>
+      </w:r>
+    </w:p>
+    <w:p>
+      <w:pPr>
+        <w:jc w:val="center"/>
+      </w:pPr>
+      <w:r>
+        <w:drawing>
+          <wp:inline xmlns:a="http://schemas.openxmlformats.org/drawingml/2006/main" xmlns:pic="http://schemas.openxmlformats.org/drawingml/2006/picture">
+            <wp:extent cx="5303520" cy="3257911"/>
+            <wp:docPr id="4" name="Picture 4"/>
+            <wp:cNvGraphicFramePr>
+              <a:graphicFrameLocks noChangeAspect="1"/>
+            </wp:cNvGraphicFramePr>
+            <a:graphic>
+              <a:graphicData uri="http://schemas.openxmlformats.org/drawingml/2006/picture">
+                <pic:pic>
+                  <pic:nvPicPr>
+                    <pic:cNvPr id="0" name="fig21_robustness_coefficients.png"/>
+                    <pic:cNvPicPr/>
+                  </pic:nvPicPr>
+                  <pic:blipFill>
+                    <a:blip r:embed="rId12"/>
+                    <a:stretch>
+                      <a:fillRect/>
+                    </a:stretch>
+                  </pic:blipFill>
+                  <pic:spPr>
+                    <a:xfrm>
+                      <a:off x="0" y="0"/>
+                      <a:ext cx="5303520" cy="3257911"/>
+                    </a:xfrm>
+                    <a:prstGeom prst="rect"/>
+                  </pic:spPr>
+                </pic:pic>
+              </a:graphicData>
+            </a:graphic>
+          </wp:inline>
+        </w:drawing>
+      </w:r>
+    </w:p>
+    <w:p>
+      <w:pPr>
+        <w:spacing w:after="200"/>
+      </w:pPr>
+      <w:r>
+        <w:rPr>
+          <w:i/>
+          <w:sz w:val="20"/>
+        </w:rPr>
+        <w:t xml:space="preserve">Note. </w:t>
+      </w:r>
+      <w:r>
+        <w:rPr>
+          <w:sz w:val="20"/>
+        </w:rPr>
+        <w:t>Effect coefficient (0–3 scale) for each result under successive covariate adjustments. * p &lt; .05. Note how adding perceived success collapses all three effects.</w:t>
+      </w:r>
+    </w:p>
+    <w:p>
+      <w:pPr>
+        <w:spacing w:before="160"/>
+      </w:pPr>
+      <w:r>
+        <w:rPr>
+          <w:b/>
+        </w:rPr>
+        <w:t>Figure 5</w:t>
+      </w:r>
+      <w:r>
+        <w:t xml:space="preserve">  </w:t>
+      </w:r>
+      <w:r>
+        <w:rPr>
+          <w:i/>
+        </w:rPr>
+        <w:t>Perceived-Success Mechanism</w:t>
+      </w:r>
+    </w:p>
+    <w:p>
+      <w:pPr>
+        <w:jc w:val="center"/>
+      </w:pPr>
+      <w:r>
+        <w:drawing>
+          <wp:inline xmlns:a="http://schemas.openxmlformats.org/drawingml/2006/main" xmlns:pic="http://schemas.openxmlformats.org/drawingml/2006/picture">
+            <wp:extent cx="4754880" cy="3664622"/>
+            <wp:docPr id="5" name="Picture 5"/>
+            <wp:cNvGraphicFramePr>
+              <a:graphicFrameLocks noChangeAspect="1"/>
+            </wp:cNvGraphicFramePr>
+            <a:graphic>
+              <a:graphicData uri="http://schemas.openxmlformats.org/drawingml/2006/picture">
+                <pic:pic>
+                  <pic:nvPicPr>
+                    <pic:cNvPr id="0" name="fig23_success_mechanism.png"/>
+                    <pic:cNvPicPr/>
+                  </pic:nvPicPr>
+                  <pic:blipFill>
+                    <a:blip r:embed="rId13"/>
+                    <a:stretch>
+                      <a:fillRect/>
+                    </a:stretch>
+                  </pic:blipFill>
+                  <pic:spPr>
+                    <a:xfrm>
+                      <a:off x="0" y="0"/>
+                      <a:ext cx="4754880" cy="3664622"/>
+                    </a:xfrm>
+                    <a:prstGeom prst="rect"/>
+                  </pic:spPr>
+                </pic:pic>
+              </a:graphicData>
+            </a:graphic>
+          </wp:inline>
+        </w:drawing>
+      </w:r>
+    </w:p>
+    <w:p>
+      <w:pPr>
+        <w:spacing w:after="200"/>
+      </w:pPr>
+      <w:r>
+        <w:rPr>
+          <w:i/>
+          <w:sz w:val="20"/>
+        </w:rPr>
+        <w:t xml:space="preserve">Note. </w:t>
+      </w:r>
+      <w:r>
+        <w:rPr>
+          <w:sz w:val="20"/>
+        </w:rPr>
+        <w:t>Within-person investment gap (SiteVision − BalanceUp) plotted against the perceived-success gap, with linear fit. Points jittered for legibility.</w:t>
+      </w:r>
+    </w:p>
+    <w:p>
+      <w:pPr>
         <w:pStyle w:val="Heading2"/>
       </w:pPr>
       <w:r>
@@ -1195,6 +1580,83 @@
       </w:pPr>
       <w:r>
         <w:t>The most important robustness finding concerns pitch presentation order. Because order was counterbalanced and approximately balanced across conditions, including it as a covariate left the average effect estimates essentially unchanged (the industry coefficient remained 0.48, p &lt; .001; the congruity coefficient 0.54, p = .001; the low-EI coefficient 0.46, but now p = .069). However, the effect-by-order interaction was large and highly significant for all three results. Each effect was very large when SiteVision was presented first and disappeared, or numerically reversed, when BalanceUp was presented first: the industry preference was +1.08 (p &lt; .001) versus −0.15 (p = .24); the congruity comparison was t = 5.89 (p &lt; .001) versus t = −0.85 (p = .40); and the low-EI comparison was t = 4.79 (p &lt; .001) versus t = −1.21 (p = .88). This pattern is consistent with a primacy or anchoring contribution, whereby participants allocated more to whichever pitch they saw first; because SiteVision is the masculine-typed venture, such an order effect mechanically resembles an industry or congruity effect. Two implications follow. The average effects are not the product of a simple confound, since order was balanced across conditions; but their generalisability is limited, because they are not stable across presentation orders. This order dependence should be disclosed transparently as a boundary condition.</w:t>
+      </w:r>
+    </w:p>
+    <w:p>
+      <w:pPr>
+        <w:spacing w:before="160"/>
+      </w:pPr>
+      <w:r>
+        <w:rPr>
+          <w:b/>
+        </w:rPr>
+        <w:t>Figure 6</w:t>
+      </w:r>
+      <w:r>
+        <w:t xml:space="preserve">  </w:t>
+      </w:r>
+      <w:r>
+        <w:rPr>
+          <w:i/>
+        </w:rPr>
+        <w:t>Effect Size by Pitch Presentation Order</w:t>
+      </w:r>
+    </w:p>
+    <w:p>
+      <w:pPr>
+        <w:jc w:val="center"/>
+      </w:pPr>
+      <w:r>
+        <w:drawing>
+          <wp:inline xmlns:a="http://schemas.openxmlformats.org/drawingml/2006/main" xmlns:pic="http://schemas.openxmlformats.org/drawingml/2006/picture">
+            <wp:extent cx="5303520" cy="3457700"/>
+            <wp:docPr id="6" name="Picture 6"/>
+            <wp:cNvGraphicFramePr>
+              <a:graphicFrameLocks noChangeAspect="1"/>
+            </wp:cNvGraphicFramePr>
+            <a:graphic>
+              <a:graphicData uri="http://schemas.openxmlformats.org/drawingml/2006/picture">
+                <pic:pic>
+                  <pic:nvPicPr>
+                    <pic:cNvPr id="0" name="fig20_pitch_order_interaction.png"/>
+                    <pic:cNvPicPr/>
+                  </pic:nvPicPr>
+                  <pic:blipFill>
+                    <a:blip r:embed="rId14"/>
+                    <a:stretch>
+                      <a:fillRect/>
+                    </a:stretch>
+                  </pic:blipFill>
+                  <pic:spPr>
+                    <a:xfrm>
+                      <a:off x="0" y="0"/>
+                      <a:ext cx="5303520" cy="3457700"/>
+                    </a:xfrm>
+                    <a:prstGeom prst="rect"/>
+                  </pic:spPr>
+                </pic:pic>
+              </a:graphicData>
+            </a:graphic>
+          </wp:inline>
+        </w:drawing>
+      </w:r>
+    </w:p>
+    <w:p>
+      <w:pPr>
+        <w:spacing w:after="200"/>
+      </w:pPr>
+      <w:r>
+        <w:rPr>
+          <w:i/>
+          <w:sz w:val="20"/>
+        </w:rPr>
+        <w:t xml:space="preserve">Note. </w:t>
+      </w:r>
+      <w:r>
+        <w:rPr>
+          <w:sz w:val="20"/>
+        </w:rPr>
+        <w:t>Mean investment difference (0–3 scale) underlying each result, split by whether SiteVision or BalanceUp was presented first. All three effects are present only when SiteVision is shown first.</w:t>
       </w:r>
     </w:p>
     <w:p>

</xml_diff>

<commit_message>
Add integrative chapter linking literature review to findings (block 32)
https://claude.ai/code/session_01L68e4qRUQ3XwBSVpuorTML
</commit_message>
<xml_diff>
--- a/analysis/32_detailed_review.docx
+++ b/analysis/32_detailed_review.docx
@@ -2245,6 +2245,102 @@
         <w:t>The analysis does not support a simple account in which emotional intelligence reduces a gender funding gap, principally because no raw gender funding gap was present to be reduced. What the data do show is, first, a strong and robust preference for the male-typed industry; second, a medium-to-large congruity advantage that is driven by that industry's perceived viability rather than by a penalty against female founders; and third, a suggestive but fragile tendency for lower-EI participants to favour the masculine-congruent venture. Across all three results the unifying mechanism is perceived probability of success, and the most serious threat to inference is the dependence of the effects on pitch presentation order. The honest narrative for the thesis is therefore one of a congruity-and-viability effect, conditioned weakly by emotional intelligence and bounded by an order sensitivity that must be reported, rather than a clean demonstration of EI as a debiasing resource.</w:t>
       </w:r>
     </w:p>
+    <w:p>
+      <w:pPr>
+        <w:pStyle w:val="Heading1"/>
+      </w:pPr>
+      <w:r>
+        <w:t>11. Integrating the Literature Review with the Findings</w:t>
+      </w:r>
+    </w:p>
+    <w:p>
+      <w:pPr>
+        <w:spacing w:line="360" w:lineRule="auto"/>
+      </w:pPr>
+      <w:r>
+        <w:t>This closing chapter draws the theoretical framework of the literature review and the empirical findings into a single, coherent account. The aim is to show where the data substantiate the theory, where they redirect it, and how the overall argument of the thesis should be positioned in light of both.</w:t>
+      </w:r>
+    </w:p>
+    <w:p>
+      <w:pPr>
+        <w:pStyle w:val="Heading2"/>
+      </w:pPr>
+      <w:r>
+        <w:t>11.1  From the Gender Funding Gap to Industry Congruity</w:t>
+      </w:r>
+    </w:p>
+    <w:p>
+      <w:pPr>
+        <w:spacing w:line="360" w:lineRule="auto"/>
+      </w:pPr>
+      <w:r>
+        <w:t>The literature review opens from the premise of a systematic gender funding gap, attributing it to investor biases rather than to differences in venture quality. The present data refine this starting point rather than confirm it. No gap emerged when founder gender was considered in isolation; instead, the organising variable was the gender-typing of the industry, with the male-typed venture systematically favoured (Result 1) and the congruity advantage following from it (Result 2). This is precisely the boundary condition the review attributes to Tonoyan and Strohmeyer (2021) and to the lack-of-fit and role-congruity traditions: bias is not a uniform main effect but is concentrated where the gender-typing of the role or industry is salient. The thesis can therefore retain the review's theoretical scaffolding while reframing its empirical claim from "a gender funding gap" to "a gender-by-industry congruity effect."</w:t>
+      </w:r>
+    </w:p>
+    <w:p>
+      <w:pPr>
+        <w:pStyle w:val="Heading2"/>
+      </w:pPr>
+      <w:r>
+        <w:t>11.2  Stereotype Content, Warmth, and the Shift to Perceived Viability</w:t>
+      </w:r>
+    </w:p>
+    <w:p>
+      <w:pPr>
+        <w:spacing w:line="360" w:lineRule="auto"/>
+      </w:pPr>
+      <w:r>
+        <w:t>The review develops the Stereotype Content Model and the BIAS-map argument of Cuddy, Fiske and Glick (2007), proposing that female founders elicit a warmth deficit and that warmth-linked emotions mediate discriminatory behaviour; this is the theoretical engine behind H9. The data do not bear this out: female-founded teams were rated no lower on warmth, and warmth did not mediate investment. What did consistently account for the effects was perceived probability of success, which correlated strongly with the investment gap and attenuated every result when controlled. Read through the Stereotype Content Model, this points away from the warmth dimension and toward the competence dimension and its behavioural correlate of perceived viability. The review can preserve the SCM framing but should pivot its emphasis from warmth-based antipathy to competence- and viability-based judgment, treating warmth mediation as an exploratory rather than central claim.</w:t>
+      </w:r>
+    </w:p>
+    <w:p>
+      <w:pPr>
+        <w:pStyle w:val="Heading2"/>
+      </w:pPr>
+      <w:r>
+        <w:t>11.3  Emotional Intelligence as a Conditional, Diffuse Moderator</w:t>
+      </w:r>
+    </w:p>
+    <w:p>
+      <w:pPr>
+        <w:spacing w:line="360" w:lineRule="auto"/>
+      </w:pPr>
+      <w:r>
+        <w:t>The review's central contribution is the proposition that emotional intelligence acts as a debiasing mechanism, with a specific theoretical bet on self-emotion appraisal as the operative dimension, grounded in Yip and Cote (2013) and the appraisal-misattribution account. The findings offer only qualified support. Emotional intelligence did not moderate a gender funding gap, because there was none to moderate, and it did not operate through self-emotion appraisal: the SEA interaction was null and wrong-signed, and no single WLEIS dimension carried the effect. The one EI-linked result — the tendency of lower-EI participants to favour the masculine-congruent venture (Result 3) — was diffuse across the total score and statistically fragile. The review should therefore present emotional intelligence as a conditional and diffuse moderator of congruity-based judgment rather than as a dimension-specific debiasing mechanism, and should soften the self-emotion-appraisal subsection from a claim to a candidate hypothesis.</w:t>
+      </w:r>
+    </w:p>
+    <w:p>
+      <w:pPr>
+        <w:pStyle w:val="Heading2"/>
+      </w:pPr>
+      <w:r>
+        <w:t>11.4  Risk, Emotion, and the Role of Perceived Success</w:t>
+      </w:r>
+    </w:p>
+    <w:p>
+      <w:pPr>
+        <w:spacing w:line="360" w:lineRule="auto"/>
+      </w:pPr>
+      <w:r>
+        <w:t>The review devotes substantial attention to risk perception and to the affective shaping of financial judgment, citing Dohmen et al. (2011) on dispositional risk and Lerner and Keltner and Yip and Cote on emotion and risk. The data align with this literature in an instructive way. Dispositional risk tolerance, measured with the Dohmen items, did not confound any result, and perceived startup risk played only a secondary role. The dominant affective-cognitive variable was instead perceived success, which behaved as the proximal driver of allocation. This positions perceived viability, rather than risk per se, as the channel through which gender-typed expectations translate into investment — a refinement the review can incorporate by connecting its risk-perception section to a success- or viability-perception mechanism.</w:t>
+      </w:r>
+    </w:p>
+    <w:p>
+      <w:pPr>
+        <w:pStyle w:val="Heading2"/>
+      </w:pPr>
+      <w:r>
+        <w:t>11.5  A Coherent Narrative for the Thesis</w:t>
+      </w:r>
+    </w:p>
+    <w:p>
+      <w:pPr>
+        <w:spacing w:line="360" w:lineRule="auto"/>
+      </w:pPr>
+      <w:r>
+        <w:t>Brought together, the literature review and the findings support a single, defensible narrative. Gender bias in startup funding, in this sample, is not a blunt gap against female founders but a congruity effect organised around industry gender-typing, expressed primarily through perceptions of venture viability, weakly and diffusely conditioned by emotional intelligence, and bounded by a sensitivity to presentation order that limits generalisability. This narrative keeps the review's theoretical foundations — role congruity, the Stereotype Content Model, and emotional intelligence as an individual-difference moderator — while honestly redirecting each in light of the evidence: from gap to congruity, from warmth to viability, and from a SEA-specific mechanism to a conditional, diffuse one. Presented this way, the thesis contributes a nuanced, empirically grounded qualification of the investor-bias literature rather than a simple confirmation of it.</w:t>
+      </w:r>
+    </w:p>
     <w:sectPr>
       <w:pgSz w:w="12240" w:h="15840"/>
       <w:pgMar w:top="1440" w:right="1584" w:bottom="1440" w:left="1584" w:header="720" w:footer="720" w:gutter="0"/>

</xml_diff>